<commit_message>
docs: custo operacional e escolhas de design e marketing
- docs/CUSTOS-OPERACIONAIS.md: preco de cada provedor (Railway, Zenvia, Meta/WhatsApp,
  Resend/Brevo, Registro.br, R2, Sentry, healthchecks), consultados em 30/10/2026 com fontes;
  cambio + IOF; estimativa de consumo do Railway; tres cenarios por volume (custo mensal, por
  atendimento e anual); custos unicos; travas de custo do codigo; esforco de operacao.
- docs/DESIGN-E-MARKETING.md: posicionamento "Clinico-premium", paleta com psicologia das cores
  e contraste de cada par, cores descartadas, status e tema escuro, tipografia, tom de voz,
  layout, acessibilidade e os recursos de marketing do sistema, com referencias.
- Capitulos 20-21 no documento do TCC (v3.6) e 16-17 no documento tecnico (v1.1);
  Documento.markdown renumera tambem o subtitulo numerado (### 2.1 -> 20.2.1); corpo_md().
- Links em PROJECT.md, ARCHITECTURE.md (D4) e README; DOCX/PDF regenerados.

Co-Authored-By: Claude Opus 5.5 <noreply@anthropic.com>
</commit_message>
<xml_diff>
--- a/docs/ShivaZen-Regras-de-Negocio.docx
+++ b/docs/ShivaZen-Regras-de-Negocio.docx
@@ -79,7 +79,7 @@
         <w:rPr>
           <w:sz w:val="22"/>
         </w:rPr>
-        <w:t>Versão 1.0  |  30/10/2026</w:t>
+        <w:t>Versão 1.1  |  30/10/2026</w:t>
       </w:r>
     </w:p>
     <w:p>
@@ -117,7 +117,7 @@
       <w:r>
         <w:fldChar w:fldCharType="separate"/>
       </w:r>
-      <w:hyperlink w:anchor="_Toc244267327" w:history="1">
+      <w:hyperlink w:anchor="_Toc244282995" w:history="1">
         <w:r>
           <w:rPr>
             <w:rStyle w:val="Hyperlink"/>
@@ -144,7 +144,7 @@
             <w:noProof/>
             <w:webHidden/>
           </w:rPr>
-          <w:instrText xml:space="preserve"> PAGEREF _Toc244267327 \h </w:instrText>
+          <w:instrText xml:space="preserve"> PAGEREF _Toc244282995 \h </w:instrText>
         </w:r>
         <w:r>
           <w:rPr>
@@ -185,7 +185,7 @@
           <w:noProof/>
         </w:rPr>
       </w:pPr>
-      <w:hyperlink w:anchor="_Toc244267328" w:history="1">
+      <w:hyperlink w:anchor="_Toc244282996" w:history="1">
         <w:r>
           <w:rPr>
             <w:rStyle w:val="Hyperlink"/>
@@ -212,7 +212,7 @@
             <w:noProof/>
             <w:webHidden/>
           </w:rPr>
-          <w:instrText xml:space="preserve"> PAGEREF _Toc244267328 \h </w:instrText>
+          <w:instrText xml:space="preserve"> PAGEREF _Toc244282996 \h </w:instrText>
         </w:r>
         <w:r>
           <w:rPr>
@@ -253,7 +253,7 @@
           <w:noProof/>
         </w:rPr>
       </w:pPr>
-      <w:hyperlink w:anchor="_Toc244267329" w:history="1">
+      <w:hyperlink w:anchor="_Toc244282997" w:history="1">
         <w:r>
           <w:rPr>
             <w:rStyle w:val="Hyperlink"/>
@@ -280,7 +280,7 @@
             <w:noProof/>
             <w:webHidden/>
           </w:rPr>
-          <w:instrText xml:space="preserve"> PAGEREF _Toc244267329 \h </w:instrText>
+          <w:instrText xml:space="preserve"> PAGEREF _Toc244282997 \h </w:instrText>
         </w:r>
         <w:r>
           <w:rPr>
@@ -321,7 +321,7 @@
           <w:noProof/>
         </w:rPr>
       </w:pPr>
-      <w:hyperlink w:anchor="_Toc244267330" w:history="1">
+      <w:hyperlink w:anchor="_Toc244282998" w:history="1">
         <w:r>
           <w:rPr>
             <w:rStyle w:val="Hyperlink"/>
@@ -348,7 +348,7 @@
             <w:noProof/>
             <w:webHidden/>
           </w:rPr>
-          <w:instrText xml:space="preserve"> PAGEREF _Toc244267330 \h </w:instrText>
+          <w:instrText xml:space="preserve"> PAGEREF _Toc244282998 \h </w:instrText>
         </w:r>
         <w:r>
           <w:rPr>
@@ -389,7 +389,7 @@
           <w:noProof/>
         </w:rPr>
       </w:pPr>
-      <w:hyperlink w:anchor="_Toc244267331" w:history="1">
+      <w:hyperlink w:anchor="_Toc244282999" w:history="1">
         <w:r>
           <w:rPr>
             <w:rStyle w:val="Hyperlink"/>
@@ -416,7 +416,7 @@
             <w:noProof/>
             <w:webHidden/>
           </w:rPr>
-          <w:instrText xml:space="preserve"> PAGEREF _Toc244267331 \h </w:instrText>
+          <w:instrText xml:space="preserve"> PAGEREF _Toc244282999 \h </w:instrText>
         </w:r>
         <w:r>
           <w:rPr>
@@ -457,7 +457,7 @@
           <w:noProof/>
         </w:rPr>
       </w:pPr>
-      <w:hyperlink w:anchor="_Toc244267332" w:history="1">
+      <w:hyperlink w:anchor="_Toc244283000" w:history="1">
         <w:r>
           <w:rPr>
             <w:rStyle w:val="Hyperlink"/>
@@ -484,7 +484,7 @@
             <w:noProof/>
             <w:webHidden/>
           </w:rPr>
-          <w:instrText xml:space="preserve"> PAGEREF _Toc244267332 \h </w:instrText>
+          <w:instrText xml:space="preserve"> PAGEREF _Toc244283000 \h </w:instrText>
         </w:r>
         <w:r>
           <w:rPr>
@@ -525,7 +525,7 @@
           <w:noProof/>
         </w:rPr>
       </w:pPr>
-      <w:hyperlink w:anchor="_Toc244267333" w:history="1">
+      <w:hyperlink w:anchor="_Toc244283001" w:history="1">
         <w:r>
           <w:rPr>
             <w:rStyle w:val="Hyperlink"/>
@@ -552,7 +552,7 @@
             <w:noProof/>
             <w:webHidden/>
           </w:rPr>
-          <w:instrText xml:space="preserve"> PAGEREF _Toc244267333 \h </w:instrText>
+          <w:instrText xml:space="preserve"> PAGEREF _Toc244283001 \h </w:instrText>
         </w:r>
         <w:r>
           <w:rPr>
@@ -593,7 +593,7 @@
           <w:noProof/>
         </w:rPr>
       </w:pPr>
-      <w:hyperlink w:anchor="_Toc244267334" w:history="1">
+      <w:hyperlink w:anchor="_Toc244283002" w:history="1">
         <w:r>
           <w:rPr>
             <w:rStyle w:val="Hyperlink"/>
@@ -620,7 +620,7 @@
             <w:noProof/>
             <w:webHidden/>
           </w:rPr>
-          <w:instrText xml:space="preserve"> PAGEREF _Toc244267334 \h </w:instrText>
+          <w:instrText xml:space="preserve"> PAGEREF _Toc244283002 \h </w:instrText>
         </w:r>
         <w:r>
           <w:rPr>
@@ -661,7 +661,7 @@
           <w:noProof/>
         </w:rPr>
       </w:pPr>
-      <w:hyperlink w:anchor="_Toc244267335" w:history="1">
+      <w:hyperlink w:anchor="_Toc244283003" w:history="1">
         <w:r>
           <w:rPr>
             <w:rStyle w:val="Hyperlink"/>
@@ -688,7 +688,7 @@
             <w:noProof/>
             <w:webHidden/>
           </w:rPr>
-          <w:instrText xml:space="preserve"> PAGEREF _Toc244267335 \h </w:instrText>
+          <w:instrText xml:space="preserve"> PAGEREF _Toc244283003 \h </w:instrText>
         </w:r>
         <w:r>
           <w:rPr>
@@ -729,7 +729,7 @@
           <w:noProof/>
         </w:rPr>
       </w:pPr>
-      <w:hyperlink w:anchor="_Toc244267336" w:history="1">
+      <w:hyperlink w:anchor="_Toc244283004" w:history="1">
         <w:r>
           <w:rPr>
             <w:rStyle w:val="Hyperlink"/>
@@ -756,7 +756,7 @@
             <w:noProof/>
             <w:webHidden/>
           </w:rPr>
-          <w:instrText xml:space="preserve"> PAGEREF _Toc244267336 \h </w:instrText>
+          <w:instrText xml:space="preserve"> PAGEREF _Toc244283004 \h </w:instrText>
         </w:r>
         <w:r>
           <w:rPr>
@@ -797,7 +797,7 @@
           <w:noProof/>
         </w:rPr>
       </w:pPr>
-      <w:hyperlink w:anchor="_Toc244267337" w:history="1">
+      <w:hyperlink w:anchor="_Toc244283005" w:history="1">
         <w:r>
           <w:rPr>
             <w:rStyle w:val="Hyperlink"/>
@@ -824,7 +824,7 @@
             <w:noProof/>
             <w:webHidden/>
           </w:rPr>
-          <w:instrText xml:space="preserve"> PAGEREF _Toc244267337 \h </w:instrText>
+          <w:instrText xml:space="preserve"> PAGEREF _Toc244283005 \h </w:instrText>
         </w:r>
         <w:r>
           <w:rPr>
@@ -865,7 +865,7 @@
           <w:noProof/>
         </w:rPr>
       </w:pPr>
-      <w:hyperlink w:anchor="_Toc244267338" w:history="1">
+      <w:hyperlink w:anchor="_Toc244283006" w:history="1">
         <w:r>
           <w:rPr>
             <w:rStyle w:val="Hyperlink"/>
@@ -892,7 +892,7 @@
             <w:noProof/>
             <w:webHidden/>
           </w:rPr>
-          <w:instrText xml:space="preserve"> PAGEREF _Toc244267338 \h </w:instrText>
+          <w:instrText xml:space="preserve"> PAGEREF _Toc244283006 \h </w:instrText>
         </w:r>
         <w:r>
           <w:rPr>
@@ -933,7 +933,7 @@
           <w:noProof/>
         </w:rPr>
       </w:pPr>
-      <w:hyperlink w:anchor="_Toc244267339" w:history="1">
+      <w:hyperlink w:anchor="_Toc244283007" w:history="1">
         <w:r>
           <w:rPr>
             <w:rStyle w:val="Hyperlink"/>
@@ -960,7 +960,7 @@
             <w:noProof/>
             <w:webHidden/>
           </w:rPr>
-          <w:instrText xml:space="preserve"> PAGEREF _Toc244267339 \h </w:instrText>
+          <w:instrText xml:space="preserve"> PAGEREF _Toc244283007 \h </w:instrText>
         </w:r>
         <w:r>
           <w:rPr>
@@ -1001,7 +1001,7 @@
           <w:noProof/>
         </w:rPr>
       </w:pPr>
-      <w:hyperlink w:anchor="_Toc244267340" w:history="1">
+      <w:hyperlink w:anchor="_Toc244283008" w:history="1">
         <w:r>
           <w:rPr>
             <w:rStyle w:val="Hyperlink"/>
@@ -1028,75 +1028,7 @@
             <w:noProof/>
             <w:webHidden/>
           </w:rPr>
-          <w:instrText xml:space="preserve"> PAGEREF _Toc244267340 \h </w:instrText>
-        </w:r>
-        <w:r>
-          <w:rPr>
-            <w:noProof/>
-            <w:webHidden/>
-          </w:rPr>
-        </w:r>
-        <w:r>
-          <w:rPr>
-            <w:noProof/>
-            <w:webHidden/>
-          </w:rPr>
-          <w:fldChar w:fldCharType="separate"/>
-        </w:r>
-        <w:r>
-          <w:rPr>
-            <w:noProof/>
-            <w:webHidden/>
-          </w:rPr>
-          <w:t>15</w:t>
-        </w:r>
-        <w:r>
-          <w:rPr>
-            <w:noProof/>
-            <w:webHidden/>
-          </w:rPr>
-          <w:fldChar w:fldCharType="end"/>
-        </w:r>
-      </w:hyperlink>
-    </w:p>
-    <w:p>
-      <w:pPr>
-        <w:pStyle w:val="Sumrio2"/>
-        <w:tabs>
-          <w:tab w:val="right" w:leader="dot" w:pos="8630"/>
-        </w:tabs>
-        <w:rPr>
-          <w:noProof/>
-        </w:rPr>
-      </w:pPr>
-      <w:hyperlink w:anchor="_Toc244267341" w:history="1">
-        <w:r>
-          <w:rPr>
-            <w:rStyle w:val="Hyperlink"/>
-            <w:noProof/>
-          </w:rPr>
-          <w:t>3.9 Lembrete D-1 e confirmação de presença</w:t>
-        </w:r>
-        <w:r>
-          <w:rPr>
-            <w:noProof/>
-            <w:webHidden/>
-          </w:rPr>
-          <w:tab/>
-        </w:r>
-        <w:r>
-          <w:rPr>
-            <w:noProof/>
-            <w:webHidden/>
-          </w:rPr>
-          <w:fldChar w:fldCharType="begin"/>
-        </w:r>
-        <w:r>
-          <w:rPr>
-            <w:noProof/>
-            <w:webHidden/>
-          </w:rPr>
-          <w:instrText xml:space="preserve"> PAGEREF _Toc244267341 \h </w:instrText>
+          <w:instrText xml:space="preserve"> PAGEREF _Toc244283008 \h </w:instrText>
         </w:r>
         <w:r>
           <w:rPr>
@@ -1137,13 +1069,13 @@
           <w:noProof/>
         </w:rPr>
       </w:pPr>
-      <w:hyperlink w:anchor="_Toc244267342" w:history="1">
+      <w:hyperlink w:anchor="_Toc244283009" w:history="1">
         <w:r>
           <w:rPr>
             <w:rStyle w:val="Hyperlink"/>
             <w:noProof/>
           </w:rPr>
-          <w:t>3.10 Faltas (no-show)</w:t>
+          <w:t>3.9 Lembrete D-1 e confirmação de presença</w:t>
         </w:r>
         <w:r>
           <w:rPr>
@@ -1164,7 +1096,7 @@
             <w:noProof/>
             <w:webHidden/>
           </w:rPr>
-          <w:instrText xml:space="preserve"> PAGEREF _Toc244267342 \h </w:instrText>
+          <w:instrText xml:space="preserve"> PAGEREF _Toc244283009 \h </w:instrText>
         </w:r>
         <w:r>
           <w:rPr>
@@ -1205,13 +1137,13 @@
           <w:noProof/>
         </w:rPr>
       </w:pPr>
-      <w:hyperlink w:anchor="_Toc244267343" w:history="1">
+      <w:hyperlink w:anchor="_Toc244283010" w:history="1">
         <w:r>
           <w:rPr>
             <w:rStyle w:val="Hyperlink"/>
             <w:noProof/>
           </w:rPr>
-          <w:t>3.11 Retorno obrigatório (F-RET)</w:t>
+          <w:t>3.10 Faltas (no-show)</w:t>
         </w:r>
         <w:r>
           <w:rPr>
@@ -1232,7 +1164,7 @@
             <w:noProof/>
             <w:webHidden/>
           </w:rPr>
-          <w:instrText xml:space="preserve"> PAGEREF _Toc244267343 \h </w:instrText>
+          <w:instrText xml:space="preserve"> PAGEREF _Toc244283010 \h </w:instrText>
         </w:r>
         <w:r>
           <w:rPr>
@@ -1273,13 +1205,13 @@
           <w:noProof/>
         </w:rPr>
       </w:pPr>
-      <w:hyperlink w:anchor="_Toc244267344" w:history="1">
+      <w:hyperlink w:anchor="_Toc244283011" w:history="1">
         <w:r>
           <w:rPr>
             <w:rStyle w:val="Hyperlink"/>
             <w:noProof/>
           </w:rPr>
-          <w:t>3.12 Pacotes</w:t>
+          <w:t>3.11 Retorno obrigatório (F-RET)</w:t>
         </w:r>
         <w:r>
           <w:rPr>
@@ -1300,7 +1232,7 @@
             <w:noProof/>
             <w:webHidden/>
           </w:rPr>
-          <w:instrText xml:space="preserve"> PAGEREF _Toc244267344 \h </w:instrText>
+          <w:instrText xml:space="preserve"> PAGEREF _Toc244283011 \h </w:instrText>
         </w:r>
         <w:r>
           <w:rPr>
@@ -1341,7 +1273,75 @@
           <w:noProof/>
         </w:rPr>
       </w:pPr>
-      <w:hyperlink w:anchor="_Toc244267345" w:history="1">
+      <w:hyperlink w:anchor="_Toc244283012" w:history="1">
+        <w:r>
+          <w:rPr>
+            <w:rStyle w:val="Hyperlink"/>
+            <w:noProof/>
+          </w:rPr>
+          <w:t>3.12 Pacotes</w:t>
+        </w:r>
+        <w:r>
+          <w:rPr>
+            <w:noProof/>
+            <w:webHidden/>
+          </w:rPr>
+          <w:tab/>
+        </w:r>
+        <w:r>
+          <w:rPr>
+            <w:noProof/>
+            <w:webHidden/>
+          </w:rPr>
+          <w:fldChar w:fldCharType="begin"/>
+        </w:r>
+        <w:r>
+          <w:rPr>
+            <w:noProof/>
+            <w:webHidden/>
+          </w:rPr>
+          <w:instrText xml:space="preserve"> PAGEREF _Toc244283012 \h </w:instrText>
+        </w:r>
+        <w:r>
+          <w:rPr>
+            <w:noProof/>
+            <w:webHidden/>
+          </w:rPr>
+        </w:r>
+        <w:r>
+          <w:rPr>
+            <w:noProof/>
+            <w:webHidden/>
+          </w:rPr>
+          <w:fldChar w:fldCharType="separate"/>
+        </w:r>
+        <w:r>
+          <w:rPr>
+            <w:noProof/>
+            <w:webHidden/>
+          </w:rPr>
+          <w:t>17</w:t>
+        </w:r>
+        <w:r>
+          <w:rPr>
+            <w:noProof/>
+            <w:webHidden/>
+          </w:rPr>
+          <w:fldChar w:fldCharType="end"/>
+        </w:r>
+      </w:hyperlink>
+    </w:p>
+    <w:p>
+      <w:pPr>
+        <w:pStyle w:val="Sumrio2"/>
+        <w:tabs>
+          <w:tab w:val="right" w:leader="dot" w:pos="8630"/>
+        </w:tabs>
+        <w:rPr>
+          <w:noProof/>
+        </w:rPr>
+      </w:pPr>
+      <w:hyperlink w:anchor="_Toc244283013" w:history="1">
         <w:r>
           <w:rPr>
             <w:rStyle w:val="Hyperlink"/>
@@ -1368,7 +1368,7 @@
             <w:noProof/>
             <w:webHidden/>
           </w:rPr>
-          <w:instrText xml:space="preserve"> PAGEREF _Toc244267345 \h </w:instrText>
+          <w:instrText xml:space="preserve"> PAGEREF _Toc244283013 \h </w:instrText>
         </w:r>
         <w:r>
           <w:rPr>
@@ -1409,7 +1409,7 @@
           <w:noProof/>
         </w:rPr>
       </w:pPr>
-      <w:hyperlink w:anchor="_Toc244267346" w:history="1">
+      <w:hyperlink w:anchor="_Toc244283014" w:history="1">
         <w:r>
           <w:rPr>
             <w:rStyle w:val="Hyperlink"/>
@@ -1436,7 +1436,7 @@
             <w:noProof/>
             <w:webHidden/>
           </w:rPr>
-          <w:instrText xml:space="preserve"> PAGEREF _Toc244267346 \h </w:instrText>
+          <w:instrText xml:space="preserve"> PAGEREF _Toc244283014 \h </w:instrText>
         </w:r>
         <w:r>
           <w:rPr>
@@ -1477,7 +1477,7 @@
           <w:noProof/>
         </w:rPr>
       </w:pPr>
-      <w:hyperlink w:anchor="_Toc244267347" w:history="1">
+      <w:hyperlink w:anchor="_Toc244283015" w:history="1">
         <w:r>
           <w:rPr>
             <w:rStyle w:val="Hyperlink"/>
@@ -1504,7 +1504,7 @@
             <w:noProof/>
             <w:webHidden/>
           </w:rPr>
-          <w:instrText xml:space="preserve"> PAGEREF _Toc244267347 \h </w:instrText>
+          <w:instrText xml:space="preserve"> PAGEREF _Toc244283015 \h </w:instrText>
         </w:r>
         <w:r>
           <w:rPr>
@@ -1545,7 +1545,7 @@
           <w:noProof/>
         </w:rPr>
       </w:pPr>
-      <w:hyperlink w:anchor="_Toc244267348" w:history="1">
+      <w:hyperlink w:anchor="_Toc244283016" w:history="1">
         <w:r>
           <w:rPr>
             <w:rStyle w:val="Hyperlink"/>
@@ -1572,7 +1572,7 @@
             <w:noProof/>
             <w:webHidden/>
           </w:rPr>
-          <w:instrText xml:space="preserve"> PAGEREF _Toc244267348 \h </w:instrText>
+          <w:instrText xml:space="preserve"> PAGEREF _Toc244283016 \h </w:instrText>
         </w:r>
         <w:r>
           <w:rPr>
@@ -1613,7 +1613,7 @@
           <w:noProof/>
         </w:rPr>
       </w:pPr>
-      <w:hyperlink w:anchor="_Toc244267349" w:history="1">
+      <w:hyperlink w:anchor="_Toc244283017" w:history="1">
         <w:r>
           <w:rPr>
             <w:rStyle w:val="Hyperlink"/>
@@ -1640,7 +1640,7 @@
             <w:noProof/>
             <w:webHidden/>
           </w:rPr>
-          <w:instrText xml:space="preserve"> PAGEREF _Toc244267349 \h </w:instrText>
+          <w:instrText xml:space="preserve"> PAGEREF _Toc244283017 \h </w:instrText>
         </w:r>
         <w:r>
           <w:rPr>
@@ -1681,7 +1681,7 @@
           <w:noProof/>
         </w:rPr>
       </w:pPr>
-      <w:hyperlink w:anchor="_Toc244267350" w:history="1">
+      <w:hyperlink w:anchor="_Toc244283018" w:history="1">
         <w:r>
           <w:rPr>
             <w:rStyle w:val="Hyperlink"/>
@@ -1708,7 +1708,7 @@
             <w:noProof/>
             <w:webHidden/>
           </w:rPr>
-          <w:instrText xml:space="preserve"> PAGEREF _Toc244267350 \h </w:instrText>
+          <w:instrText xml:space="preserve"> PAGEREF _Toc244283018 \h </w:instrText>
         </w:r>
         <w:r>
           <w:rPr>
@@ -1749,7 +1749,7 @@
           <w:noProof/>
         </w:rPr>
       </w:pPr>
-      <w:hyperlink w:anchor="_Toc244267351" w:history="1">
+      <w:hyperlink w:anchor="_Toc244283019" w:history="1">
         <w:r>
           <w:rPr>
             <w:rStyle w:val="Hyperlink"/>
@@ -1776,7 +1776,7 @@
             <w:noProof/>
             <w:webHidden/>
           </w:rPr>
-          <w:instrText xml:space="preserve"> PAGEREF _Toc244267351 \h </w:instrText>
+          <w:instrText xml:space="preserve"> PAGEREF _Toc244283019 \h </w:instrText>
         </w:r>
         <w:r>
           <w:rPr>
@@ -1817,7 +1817,7 @@
           <w:noProof/>
         </w:rPr>
       </w:pPr>
-      <w:hyperlink w:anchor="_Toc244267352" w:history="1">
+      <w:hyperlink w:anchor="_Toc244283020" w:history="1">
         <w:r>
           <w:rPr>
             <w:rStyle w:val="Hyperlink"/>
@@ -1844,7 +1844,7 @@
             <w:noProof/>
             <w:webHidden/>
           </w:rPr>
-          <w:instrText xml:space="preserve"> PAGEREF _Toc244267352 \h </w:instrText>
+          <w:instrText xml:space="preserve"> PAGEREF _Toc244283020 \h </w:instrText>
         </w:r>
         <w:r>
           <w:rPr>
@@ -1885,7 +1885,7 @@
           <w:noProof/>
         </w:rPr>
       </w:pPr>
-      <w:hyperlink w:anchor="_Toc244267353" w:history="1">
+      <w:hyperlink w:anchor="_Toc244283021" w:history="1">
         <w:r>
           <w:rPr>
             <w:rStyle w:val="Hyperlink"/>
@@ -1912,7 +1912,7 @@
             <w:noProof/>
             <w:webHidden/>
           </w:rPr>
-          <w:instrText xml:space="preserve"> PAGEREF _Toc244267353 \h </w:instrText>
+          <w:instrText xml:space="preserve"> PAGEREF _Toc244283021 \h </w:instrText>
         </w:r>
         <w:r>
           <w:rPr>
@@ -1953,7 +1953,7 @@
           <w:noProof/>
         </w:rPr>
       </w:pPr>
-      <w:hyperlink w:anchor="_Toc244267354" w:history="1">
+      <w:hyperlink w:anchor="_Toc244283022" w:history="1">
         <w:r>
           <w:rPr>
             <w:rStyle w:val="Hyperlink"/>
@@ -1980,7 +1980,7 @@
             <w:noProof/>
             <w:webHidden/>
           </w:rPr>
-          <w:instrText xml:space="preserve"> PAGEREF _Toc244267354 \h </w:instrText>
+          <w:instrText xml:space="preserve"> PAGEREF _Toc244283022 \h </w:instrText>
         </w:r>
         <w:r>
           <w:rPr>
@@ -2021,7 +2021,7 @@
           <w:noProof/>
         </w:rPr>
       </w:pPr>
-      <w:hyperlink w:anchor="_Toc244267355" w:history="1">
+      <w:hyperlink w:anchor="_Toc244283023" w:history="1">
         <w:r>
           <w:rPr>
             <w:rStyle w:val="Hyperlink"/>
@@ -2048,7 +2048,7 @@
             <w:noProof/>
             <w:webHidden/>
           </w:rPr>
-          <w:instrText xml:space="preserve"> PAGEREF _Toc244267355 \h </w:instrText>
+          <w:instrText xml:space="preserve"> PAGEREF _Toc244283023 \h </w:instrText>
         </w:r>
         <w:r>
           <w:rPr>
@@ -2089,7 +2089,7 @@
           <w:noProof/>
         </w:rPr>
       </w:pPr>
-      <w:hyperlink w:anchor="_Toc244267356" w:history="1">
+      <w:hyperlink w:anchor="_Toc244283024" w:history="1">
         <w:r>
           <w:rPr>
             <w:rStyle w:val="Hyperlink"/>
@@ -2116,7 +2116,7 @@
             <w:noProof/>
             <w:webHidden/>
           </w:rPr>
-          <w:instrText xml:space="preserve"> PAGEREF _Toc244267356 \h </w:instrText>
+          <w:instrText xml:space="preserve"> PAGEREF _Toc244283024 \h </w:instrText>
         </w:r>
         <w:r>
           <w:rPr>
@@ -2157,7 +2157,7 @@
           <w:noProof/>
         </w:rPr>
       </w:pPr>
-      <w:hyperlink w:anchor="_Toc244267357" w:history="1">
+      <w:hyperlink w:anchor="_Toc244283025" w:history="1">
         <w:r>
           <w:rPr>
             <w:rStyle w:val="Hyperlink"/>
@@ -2184,7 +2184,7 @@
             <w:noProof/>
             <w:webHidden/>
           </w:rPr>
-          <w:instrText xml:space="preserve"> PAGEREF _Toc244267357 \h </w:instrText>
+          <w:instrText xml:space="preserve"> PAGEREF _Toc244283025 \h </w:instrText>
         </w:r>
         <w:r>
           <w:rPr>
@@ -2225,7 +2225,7 @@
           <w:noProof/>
         </w:rPr>
       </w:pPr>
-      <w:hyperlink w:anchor="_Toc244267358" w:history="1">
+      <w:hyperlink w:anchor="_Toc244283026" w:history="1">
         <w:r>
           <w:rPr>
             <w:rStyle w:val="Hyperlink"/>
@@ -2252,7 +2252,7 @@
             <w:noProof/>
             <w:webHidden/>
           </w:rPr>
-          <w:instrText xml:space="preserve"> PAGEREF _Toc244267358 \h </w:instrText>
+          <w:instrText xml:space="preserve"> PAGEREF _Toc244283026 \h </w:instrText>
         </w:r>
         <w:r>
           <w:rPr>
@@ -2297,7 +2297,7 @@
       <w:pPr>
         <w:pStyle w:val="Ttulo1"/>
       </w:pPr>
-      <w:bookmarkStart w:id="0" w:name="_Toc244267327"/>
+      <w:bookmarkStart w:id="0" w:name="_Toc244282995"/>
       <w:r>
         <w:lastRenderedPageBreak/>
         <w:t>1. Introdução</w:t>
@@ -2308,7 +2308,7 @@
       <w:pPr>
         <w:pStyle w:val="Ttulo2"/>
       </w:pPr>
-      <w:bookmarkStart w:id="1" w:name="_Toc244267328"/>
+      <w:bookmarkStart w:id="1" w:name="_Toc244282996"/>
       <w:r>
         <w:t>1.1 Objetivo</w:t>
       </w:r>
@@ -2323,7 +2323,7 @@
       <w:pPr>
         <w:pStyle w:val="Ttulo2"/>
       </w:pPr>
-      <w:bookmarkStart w:id="2" w:name="_Toc244267329"/>
+      <w:bookmarkStart w:id="2" w:name="_Toc244282997"/>
       <w:r>
         <w:t>1.2 Como ler</w:t>
       </w:r>
@@ -2418,7 +2418,7 @@
       <w:pPr>
         <w:pStyle w:val="Ttulo2"/>
       </w:pPr>
-      <w:bookmarkStart w:id="3" w:name="_Toc244267330"/>
+      <w:bookmarkStart w:id="3" w:name="_Toc244282998"/>
       <w:r>
         <w:t>1.3 Princípios</w:t>
       </w:r>
@@ -2505,7 +2505,7 @@
       <w:pPr>
         <w:pStyle w:val="Ttulo1"/>
       </w:pPr>
-      <w:bookmarkStart w:id="4" w:name="_Toc244267331"/>
+      <w:bookmarkStart w:id="4" w:name="_Toc244282999"/>
       <w:r>
         <w:t>2. Catálogo das regras de negócio</w:t>
       </w:r>
@@ -5791,7 +5791,13 @@
               <w:rPr>
                 <w:sz w:val="17"/>
               </w:rPr>
-              <w:t>Folga (do profissional ou da clínica inteira: feriado nacional/local e recesso, carregados pelo job mensal de feriados), horário diferente (1 por profissional/dia) e bloqueio (pontual ou recorrente por RRULE diária/semanal/mensal). Grade sem janelas sobrepostas e folgas do mesmo profissional sem sobreposição (EXCLUDE). Exceção inativa fica registrada e é ignorada (ex.: feriado em que a clínica abre).</w:t>
+              <w:t>Folga (do profissional ou da clínica inteira: feriado nacional/local e recesso, carregados pelo job mensal de feriados), horário diferente (1 por profissional/dia) e bloqueio (pontual ou recorrente por RRULE diária/semanal/mensal). Grade sem janelas sobrepostas e folgas do mesmo profissional sem sobreposição (EXCLUDE). Exceção inativa fica registrada e é ignorada (ex.: feriado em que a clínica abre). Folga, horário diferente e bloqueio que cobririam atendimento futuro ainda ativo são recusados listando-os (</w:t>
+            </w:r>
+            <w:r>
+              <w:rPr>
+                <w:sz w:val="17"/>
+              </w:rPr>
+              <w:t>reagendar ou cancelar antes), como a edição da grade.</w:t>
             </w:r>
           </w:p>
         </w:tc>
@@ -6583,7 +6589,7 @@
       <w:pPr>
         <w:pStyle w:val="Ttulo1"/>
       </w:pPr>
-      <w:bookmarkStart w:id="5" w:name="_Toc244267332"/>
+      <w:bookmarkStart w:id="5" w:name="_Toc244283000"/>
       <w:r>
         <w:t>3. Especificação detalhada por área</w:t>
       </w:r>
@@ -6593,7 +6599,7 @@
       <w:pPr>
         <w:pStyle w:val="Ttulo2"/>
       </w:pPr>
-      <w:bookmarkStart w:id="6" w:name="_Toc244267333"/>
+      <w:bookmarkStart w:id="6" w:name="_Toc244283001"/>
       <w:r>
         <w:t>3.1 Atores e papéis</w:t>
       </w:r>
@@ -6763,7 +6769,7 @@
       <w:pPr>
         <w:pStyle w:val="Ttulo2"/>
       </w:pPr>
-      <w:bookmarkStart w:id="7" w:name="_Toc244267334"/>
+      <w:bookmarkStart w:id="7" w:name="_Toc244283002"/>
       <w:r>
         <w:t>3.2 Cliente</w:t>
       </w:r>
@@ -7027,7 +7033,7 @@
       <w:pPr>
         <w:pStyle w:val="Ttulo2"/>
       </w:pPr>
-      <w:bookmarkStart w:id="8" w:name="_Toc244267335"/>
+      <w:bookmarkStart w:id="8" w:name="_Toc244283003"/>
       <w:r>
         <w:t>3.3 Agendamento público (wizard)</w:t>
       </w:r>
@@ -7786,7 +7792,7 @@
       <w:pPr>
         <w:pStyle w:val="Ttulo2"/>
       </w:pPr>
-      <w:bookmarkStart w:id="9" w:name="_Toc244267336"/>
+      <w:bookmarkStart w:id="9" w:name="_Toc244283004"/>
       <w:r>
         <w:t>3.4 Agendamento interno (recepção, no painel)</w:t>
       </w:r>
@@ -8038,7 +8044,7 @@
       <w:pPr>
         <w:pStyle w:val="Ttulo2"/>
       </w:pPr>
-      <w:bookmarkStart w:id="10" w:name="_Toc244267337"/>
+      <w:bookmarkStart w:id="10" w:name="_Toc244283005"/>
       <w:r>
         <w:t>3.5 Disponibilidade (SlotService)</w:t>
       </w:r>
@@ -8145,13 +8151,45 @@
           <w:sz w:val="20"/>
         </w:rPr>
         <w:t>.</w:t>
+      </w:r>
+    </w:p>
+    <w:p>
+      <w:pPr>
+        <w:pStyle w:val="Commarcadores"/>
+      </w:pPr>
+      <w:r>
+        <w:rPr>
+          <w:b/>
+          <w:sz w:val="19"/>
+        </w:rPr>
+        <w:t>Folga, horário diferente e bloqueio não cobrem atendimento já marcado:</w:t>
+      </w:r>
+      <w:r>
+        <w:rPr>
+          <w:sz w:val="19"/>
+        </w:rPr>
+        <w:t xml:space="preserve"> criar (ou reenviar) uma folga no dia, um horário diferente que deixa um atendimento fora da nova janela ou um bloqueio (da profissional ou de todos) sobre o horário de um atendimento futuro ainda ativo é recusado listando os 5 primeiros e o total — reagende ou cancele antes. É a mesma regra da edição da grade da profissional (§3.1): antes o atendimento ficava na agenda de quem estava de folga e o lembrete D-1 confirmava a presença (</w:t>
+      </w:r>
+      <w:r>
+        <w:rPr>
+          <w:rFonts w:ascii="Consolas" w:hAnsi="Consolas"/>
+          <w:color w:val="7A3E1D"/>
+          <w:sz w:val="17"/>
+        </w:rPr>
+        <w:t>services/agenda.marcados_no_periodo</w:t>
+      </w:r>
+      <w:r>
+        <w:rPr>
+          <w:sz w:val="19"/>
+        </w:rPr>
+        <w:t>).</w:t>
       </w:r>
     </w:p>
     <w:p>
       <w:pPr>
         <w:pStyle w:val="Ttulo2"/>
       </w:pPr>
-      <w:bookmarkStart w:id="11" w:name="_Toc244267338"/>
+      <w:bookmarkStart w:id="11" w:name="_Toc244283006"/>
       <w:r>
         <w:t>3.6 Máquina de estados do atendimento (FSM)</w:t>
       </w:r>
@@ -8614,7 +8652,7 @@
       <w:pPr>
         <w:pStyle w:val="Ttulo2"/>
       </w:pPr>
-      <w:bookmarkStart w:id="12" w:name="_Toc244267339"/>
+      <w:bookmarkStart w:id="12" w:name="_Toc244283007"/>
       <w:r>
         <w:t>3.7 Aprovação e rejeição</w:t>
       </w:r>
@@ -9166,7 +9204,7 @@
       <w:pPr>
         <w:pStyle w:val="Ttulo2"/>
       </w:pPr>
-      <w:bookmarkStart w:id="13" w:name="_Toc244267340"/>
+      <w:bookmarkStart w:id="13" w:name="_Toc244283008"/>
       <w:r>
         <w:t>3.8 Reagendamento e cancelamento</w:t>
       </w:r>
@@ -9549,7 +9587,7 @@
       <w:pPr>
         <w:pStyle w:val="Ttulo2"/>
       </w:pPr>
-      <w:bookmarkStart w:id="14" w:name="_Toc244267341"/>
+      <w:bookmarkStart w:id="14" w:name="_Toc244283009"/>
       <w:r>
         <w:t>3.9 Lembrete D-1 e confirmação de presença</w:t>
       </w:r>
@@ -9742,7 +9780,7 @@
       <w:pPr>
         <w:pStyle w:val="Ttulo2"/>
       </w:pPr>
-      <w:bookmarkStart w:id="15" w:name="_Toc244267342"/>
+      <w:bookmarkStart w:id="15" w:name="_Toc244283010"/>
       <w:r>
         <w:t>3.10 Faltas (no-show)</w:t>
       </w:r>
@@ -9838,7 +9876,7 @@
       <w:pPr>
         <w:pStyle w:val="Ttulo2"/>
       </w:pPr>
-      <w:bookmarkStart w:id="16" w:name="_Toc244267343"/>
+      <w:bookmarkStart w:id="16" w:name="_Toc244283011"/>
       <w:r>
         <w:t>3.11 Retorno obrigatório (F-RET)</w:t>
       </w:r>
@@ -10113,7 +10151,7 @@
       <w:pPr>
         <w:pStyle w:val="Ttulo2"/>
       </w:pPr>
-      <w:bookmarkStart w:id="17" w:name="_Toc244267344"/>
+      <w:bookmarkStart w:id="17" w:name="_Toc244283012"/>
       <w:r>
         <w:t>3.12 Pacotes</w:t>
       </w:r>
@@ -10504,7 +10542,7 @@
       <w:pPr>
         <w:pStyle w:val="Ttulo2"/>
       </w:pPr>
-      <w:bookmarkStart w:id="18" w:name="_Toc244267345"/>
+      <w:bookmarkStart w:id="18" w:name="_Toc244283013"/>
       <w:r>
         <w:t>3.13 Preços e promoções</w:t>
       </w:r>
@@ -10760,7 +10798,7 @@
       <w:pPr>
         <w:pStyle w:val="Ttulo2"/>
       </w:pPr>
-      <w:bookmarkStart w:id="19" w:name="_Toc244267346"/>
+      <w:bookmarkStart w:id="19" w:name="_Toc244283014"/>
       <w:r>
         <w:t>3.14 Valor cobrado e faturamento</w:t>
       </w:r>
@@ -11058,7 +11096,7 @@
       <w:pPr>
         <w:pStyle w:val="Ttulo2"/>
       </w:pPr>
-      <w:bookmarkStart w:id="20" w:name="_Toc244267347"/>
+      <w:bookmarkStart w:id="20" w:name="_Toc244283015"/>
       <w:r>
         <w:t>3.15 Comissão do profissional</w:t>
       </w:r>
@@ -11347,7 +11385,7 @@
       <w:pPr>
         <w:pStyle w:val="Ttulo2"/>
       </w:pPr>
-      <w:bookmarkStart w:id="21" w:name="_Toc244267348"/>
+      <w:bookmarkStart w:id="21" w:name="_Toc244283016"/>
       <w:r>
         <w:t>3.16 Cashback por indicação (F-CSB) e carteira</w:t>
       </w:r>
@@ -11574,7 +11612,7 @@
       <w:pPr>
         <w:pStyle w:val="Ttulo2"/>
       </w:pPr>
-      <w:bookmarkStart w:id="22" w:name="_Toc244267349"/>
+      <w:bookmarkStart w:id="22" w:name="_Toc244283017"/>
       <w:r>
         <w:t>3.17 Lista de espera</w:t>
       </w:r>
@@ -11899,7 +11937,7 @@
       <w:pPr>
         <w:pStyle w:val="Ttulo2"/>
       </w:pPr>
-      <w:bookmarkStart w:id="23" w:name="_Toc244267350"/>
+      <w:bookmarkStart w:id="23" w:name="_Toc244283018"/>
       <w:r>
         <w:t>3.18 NPS e depoimentos</w:t>
       </w:r>
@@ -12462,7 +12500,7 @@
       <w:pPr>
         <w:pStyle w:val="Ttulo2"/>
       </w:pPr>
-      <w:bookmarkStart w:id="24" w:name="_Toc244267351"/>
+      <w:bookmarkStart w:id="24" w:name="_Toc244283019"/>
       <w:r>
         <w:t>3.19 Aniversário e e-mails de promoção</w:t>
       </w:r>
@@ -12619,7 +12657,7 @@
       <w:pPr>
         <w:pStyle w:val="Ttulo2"/>
       </w:pPr>
-      <w:bookmarkStart w:id="25" w:name="_Toc244267352"/>
+      <w:bookmarkStart w:id="25" w:name="_Toc244283020"/>
       <w:r>
         <w:t>3.20 Ficha (prontuário), histórico, anotações, anamnese e alertas</w:t>
       </w:r>
@@ -13093,7 +13131,7 @@
       <w:pPr>
         <w:pStyle w:val="Ttulo2"/>
       </w:pPr>
-      <w:bookmarkStart w:id="26" w:name="_Toc244267353"/>
+      <w:bookmarkStart w:id="26" w:name="_Toc244283021"/>
       <w:r>
         <w:t>3.21 Termos e consentimentos (LGPD)</w:t>
       </w:r>
@@ -13643,7 +13681,7 @@
       <w:pPr>
         <w:pStyle w:val="Ttulo2"/>
       </w:pPr>
-      <w:bookmarkStart w:id="27" w:name="_Toc244267354"/>
+      <w:bookmarkStart w:id="27" w:name="_Toc244283022"/>
       <w:r>
         <w:t>3.22 Retenção e esquecimento</w:t>
       </w:r>
@@ -14523,7 +14561,7 @@
       <w:pPr>
         <w:pStyle w:val="Ttulo2"/>
       </w:pPr>
-      <w:bookmarkStart w:id="28" w:name="_Toc244267355"/>
+      <w:bookmarkStart w:id="28" w:name="_Toc244283023"/>
       <w:r>
         <w:t>3.23 Efeitos automáticos por transição</w:t>
       </w:r>
@@ -14862,7 +14900,7 @@
       <w:pPr>
         <w:pStyle w:val="Ttulo2"/>
       </w:pPr>
-      <w:bookmarkStart w:id="29" w:name="_Toc244267356"/>
+      <w:bookmarkStart w:id="29" w:name="_Toc244283024"/>
       <w:r>
         <w:t>3.24 Valores-chave</w:t>
       </w:r>
@@ -17139,7 +17177,7 @@
       <w:pPr>
         <w:pStyle w:val="Ttulo1"/>
       </w:pPr>
-      <w:bookmarkStart w:id="30" w:name="_Toc244267357"/>
+      <w:bookmarkStart w:id="30" w:name="_Toc244283025"/>
       <w:r>
         <w:t>4. Diagramas de apoio</w:t>
       </w:r>
@@ -17165,7 +17203,7 @@
           <w:noProof/>
         </w:rPr>
         <w:drawing>
-          <wp:inline distT="0" distB="0" distL="0" distR="0" wp14:anchorId="64489FBA" wp14:editId="51249416">
+          <wp:inline distT="0" distB="0" distL="0" distR="0" wp14:anchorId="7443A604" wp14:editId="6244E841">
             <wp:extent cx="7772400" cy="4630161"/>
             <wp:effectExtent l="0" t="0" r="0" b="0"/>
             <wp:docPr id="1" name="Picture 1"/>
@@ -17228,7 +17266,7 @@
           <w:noProof/>
         </w:rPr>
         <w:drawing>
-          <wp:inline distT="0" distB="0" distL="0" distR="0" wp14:anchorId="0351F0F4" wp14:editId="799575C3">
+          <wp:inline distT="0" distB="0" distL="0" distR="0" wp14:anchorId="088EE8BF" wp14:editId="6D83A6C6">
             <wp:extent cx="7772400" cy="4159284"/>
             <wp:effectExtent l="0" t="0" r="0" b="0"/>
             <wp:docPr id="2" name="Picture 2"/>
@@ -17291,7 +17329,7 @@
           <w:noProof/>
         </w:rPr>
         <w:drawing>
-          <wp:inline distT="0" distB="0" distL="0" distR="0" wp14:anchorId="75D3B1B9" wp14:editId="55560F1A">
+          <wp:inline distT="0" distB="0" distL="0" distR="0" wp14:anchorId="6EA1ED64" wp14:editId="551D1215">
             <wp:extent cx="7772400" cy="3905302"/>
             <wp:effectExtent l="0" t="0" r="0" b="0"/>
             <wp:docPr id="3" name="Picture 3"/>
@@ -17359,7 +17397,7 @@
           <w:noProof/>
         </w:rPr>
         <w:drawing>
-          <wp:inline distT="0" distB="0" distL="0" distR="0" wp14:anchorId="618E2CE3" wp14:editId="265CF581">
+          <wp:inline distT="0" distB="0" distL="0" distR="0" wp14:anchorId="574B9A1A" wp14:editId="0A63B58F">
             <wp:extent cx="5486400" cy="6441815"/>
             <wp:effectExtent l="0" t="0" r="0" b="0"/>
             <wp:docPr id="4" name="Picture 4"/>
@@ -17417,7 +17455,7 @@
           <w:noProof/>
         </w:rPr>
         <w:drawing>
-          <wp:inline distT="0" distB="0" distL="0" distR="0" wp14:anchorId="57432510" wp14:editId="45F1B06D">
+          <wp:inline distT="0" distB="0" distL="0" distR="0" wp14:anchorId="2E38E7D2" wp14:editId="582237F5">
             <wp:extent cx="5486400" cy="7248088"/>
             <wp:effectExtent l="0" t="0" r="0" b="0"/>
             <wp:docPr id="5" name="Picture 5"/>
@@ -17475,7 +17513,7 @@
           <w:noProof/>
         </w:rPr>
         <w:drawing>
-          <wp:inline distT="0" distB="0" distL="0" distR="0" wp14:anchorId="640A28BA" wp14:editId="74C94D52">
+          <wp:inline distT="0" distB="0" distL="0" distR="0" wp14:anchorId="33C99596" wp14:editId="577C5E54">
             <wp:extent cx="5486400" cy="6703888"/>
             <wp:effectExtent l="0" t="0" r="0" b="0"/>
             <wp:docPr id="6" name="Picture 6"/>
@@ -17533,7 +17571,7 @@
       <w:pPr>
         <w:pStyle w:val="Ttulo1"/>
       </w:pPr>
-      <w:bookmarkStart w:id="31" w:name="_Toc244267358"/>
+      <w:bookmarkStart w:id="31" w:name="_Toc244283026"/>
       <w:r>
         <w:t>5. Glossário</w:t>
       </w:r>
@@ -19983,7 +20021,7 @@
       <w:rPr>
         <w:sz w:val="16"/>
       </w:rPr>
-      <w:t xml:space="preserve">Shiva Zen — Regras de Negócio v1.0   |   Pág. </w:t>
+      <w:t xml:space="preserve">Shiva Zen — Regras de Negócio v1.1   |   Pág. </w:t>
     </w:r>
     <w:r>
       <w:rPr>
@@ -20218,31 +20256,31 @@
       </w:rPr>
     </w:lvl>
   </w:abstractNum>
-  <w:num w:numId="1" w16cid:durableId="1504467089">
+  <w:num w:numId="1" w16cid:durableId="435948620">
     <w:abstractNumId w:val="8"/>
   </w:num>
-  <w:num w:numId="2" w16cid:durableId="1173495048">
+  <w:num w:numId="2" w16cid:durableId="587465998">
     <w:abstractNumId w:val="6"/>
   </w:num>
-  <w:num w:numId="3" w16cid:durableId="952399266">
+  <w:num w:numId="3" w16cid:durableId="1458987751">
     <w:abstractNumId w:val="5"/>
   </w:num>
-  <w:num w:numId="4" w16cid:durableId="1200631573">
+  <w:num w:numId="4" w16cid:durableId="2140487809">
     <w:abstractNumId w:val="4"/>
   </w:num>
-  <w:num w:numId="5" w16cid:durableId="1838422260">
+  <w:num w:numId="5" w16cid:durableId="2139106402">
     <w:abstractNumId w:val="7"/>
   </w:num>
-  <w:num w:numId="6" w16cid:durableId="49770419">
+  <w:num w:numId="6" w16cid:durableId="1366491202">
     <w:abstractNumId w:val="3"/>
   </w:num>
-  <w:num w:numId="7" w16cid:durableId="1073577296">
+  <w:num w:numId="7" w16cid:durableId="559361632">
     <w:abstractNumId w:val="2"/>
   </w:num>
-  <w:num w:numId="8" w16cid:durableId="667636043">
+  <w:num w:numId="8" w16cid:durableId="141623510">
     <w:abstractNumId w:val="1"/>
   </w:num>
-  <w:num w:numId="9" w16cid:durableId="390810339">
+  <w:num w:numId="9" w16cid:durableId="746727255">
     <w:abstractNumId w:val="0"/>
   </w:num>
 </w:numbering>
@@ -31640,7 +31678,7 @@
     <w:autoRedefine/>
     <w:uiPriority w:val="39"/>
     <w:unhideWhenUsed/>
-    <w:rsid w:val="00E366D6"/>
+    <w:rsid w:val="00AB77EE"/>
     <w:pPr>
       <w:spacing w:after="100"/>
     </w:pPr>
@@ -31652,7 +31690,7 @@
     <w:autoRedefine/>
     <w:uiPriority w:val="39"/>
     <w:unhideWhenUsed/>
-    <w:rsid w:val="00E366D6"/>
+    <w:rsid w:val="00AB77EE"/>
     <w:pPr>
       <w:spacing w:after="100"/>
       <w:ind w:left="210"/>
@@ -31663,7 +31701,7 @@
     <w:basedOn w:val="Fontepargpadro"/>
     <w:uiPriority w:val="99"/>
     <w:unhideWhenUsed/>
-    <w:rsid w:val="00E366D6"/>
+    <w:rsid w:val="00AB77EE"/>
     <w:rPr>
       <w:color w:val="0000FF" w:themeColor="hyperlink"/>
       <w:u w:val="single"/>

</xml_diff>